<commit_message>
Auto commit (2026-09-15 18:21) — 5 changes
Claude Code 세션 종료 시 자동 커밋.

Co-Authored-By: Claude <noreply@anthropic.com>
Claude-Session: https://claude.ai/code/ba1db683-ff75-472c-99dc-e337a67451b4
</commit_message>
<xml_diff>
--- a/projects/33_slave_husband/밤마다 나를 탐하는 노예 남편_대본 전체 피드백_v1.docx
+++ b/projects/33_slave_husband/밤마다 나를 탐하는 노예 남편_대본 전체 피드백_v1.docx
@@ -79,10 +79,10 @@
         <w:rPr>
           <w:b/>
         </w:rPr>
-        <w:t>1. 무료는 원 대본 1~15화를 6화로 다시 잡습니다.</w:t>
+        <w:t>1. 무료 6화는 농막 하나에서 밤 여섯 번으로 잡습니다.</w:t>
       </w:r>
       <w:r>
-        <w:t xml:space="preserve">  별지 트리트먼트가 그 안이에요. 1화에 농막 밤 첫 컷과 강제혼, 2화에 노예시장과 첫 밤, 3화에 상과 벌, 4화에 계모의 첫 시선과 백작가 귀가, 5화에 서재 누명, 6화에 지하 창고 "널 믿어"와 수조 뛰어들기까지. 마지막 무료는 아리아가 물에 몸을 던지는 순간에서 끊고, 사슬이 끊어지고 수조가 깨지는 건 유료 첫 화 첫 컷입니다. 반지 모함(2화)과 거리 험담(2화)은 빼도 됩니다. 와인 자해와 가시 자해 두 번이면 아리아가 13화에서 "또 그 수법이잖아"라고 알아보는 근거로 충분해요.</w:t>
+        <w:t xml:space="preserve">  별지 트리트먼트가 그 안이에요. 제목이 파는 건 묶인 남자가 밤마다 나를 탐한다는 건데, 원 대본은 밤이 4~6화에만 있고 나머지는 계모·아버지·후작이 방 안에서 말로 만드는 사건입니다. 와인 자해, 반지 모함, 가시 자해, 거리 험담, 서재 누명, 지하 창고, 수조가 무료 안에 다 들어오면 연극이 돼요. 무료에서는 아리아가 남편을 사고, 밤마다 묶고, 상과 벌을 주고, 뺏으러 오는 손(하인 횃불·후작 사병)을 에단이 문 앞에서 꺾는 것까지만. 1화 첫 컷(묶인 남자, 밧줄 끊김)이 6화 마지막 장면이고, 6화는 「물어뜯으려면 제대로 해봐. 내가 생각보다 목숨이 질기거든.」에서 끊습니다. 계모의 유혹·누명·처형·정체 공개는 전부 유료 7화부터예요. 1화 지문에 "침대 기둥에는 밧줄이 여러 번 감긴 자국"이라고 쓰셨죠. 그게 이 작품의 무료 6화입니다.</w:t>
       </w:r>
     </w:p>
     <w:p>
@@ -121,10 +121,10 @@
         <w:rPr>
           <w:b/>
         </w:rPr>
-        <w:t>4. 아리아가 몸으로 목숨을 거는 건 수조 한 번이면 됩니다.</w:t>
+        <w:t>4. 아리아가 몸으로 목숨을 거는 건 한 번이면 됩니다.</w:t>
       </w:r>
       <w:r>
-        <w:t xml:space="preserve">  15화 수조, 17화 독 가시 터널, 30화 설산이 다 아리아 몸이 망가진 뒤 에단이 구하는 같은 장면이에요. 수조는 무료 끝이라 살리고, 규칙만 한 줄로 분명하게 해 주세요. "네가 물속에서 숨을 참는 동안만 저놈은 산다. 네가 물 밖으로 나오는 순간 처형이다." 17화 광장은 처형장으로 두되 아리아가 가시를 기어가는 건 빼고, 그레이스가 마비 독을 놓는 것과 독살 폭로만 남기면 됩니다. 설산은 3번과 함께 나갑니다.</w:t>
+        <w:t xml:space="preserve">  수조, 독 가시 터널, 설산이 다 아리아 몸이 망가진 뒤 에단이 구하는 같은 장면이에요. 유료로 넘어간 수조를 살리시려면 규칙만 한 줄로 분명하게 해 주세요. "네가 물속에서 숨을 참는 동안만 저놈은 산다. 네가 물 밖으로 나오는 순간 처형이다." 광장은 처형장으로 두되 가시를 기어가는 건 빼고, 그레이스의 마비 독과 독살 폭로만 남기면 됩니다. 설산은 3번과 함께 나갑니다.</w:t>
       </w:r>
     </w:p>
     <w:p>

</xml_diff>